<commit_message>
Business plan: add MVI "Perfect Visit" certification as competitive advantage
Adds the MultiView Incorporated (MVI) "Perfect Visit" / "Perfect Phones"
certification and Andrew Reid's national multi-platform co-marketing campaign as
a competitive differentiator, in three places:
- Section 04 Competitive Analysis: new subsection 4.1 + a differentiation bullet
- Section 05 SWOT: Opportunities bullet
- Section 06.5 Marketing: in-tandem local campaign timed to the national push

Framed explicitly as incremental UPSIDE: the Section 11 projections and DSCR
remain conservative and assume no lift from the certification or campaign, so the
loan is serviceable on the base case without it. Financial model left unchanged
to preserve the conservative underwriting posture.

https://claude.ai/code/session_01GAHLyfqLR9bxwN2jm6VjPU
</commit_message>
<xml_diff>
--- a/sba_application/03_business_plan/Azalea_SBA_Business_Plan_Rev5.00.docx
+++ b/sba_application/03_business_plan/Azalea_SBA_Business_Plan_Rev5.00.docx
@@ -2172,6 +2172,56 @@
     </w:p>
     <w:p>
       <w:r>
+        <w:rPr>
+          <w:b w:val="0"/>
+          <w:i w:val="0"/>
+          <w:sz w:val="21"/>
+        </w:rPr>
+        <w:t xml:space="preserve">  - MVI-certified in The Perfect Visit and Perfect Phones - national co-marketing exposure that local and regional competitors lack (see 4.1)</w:t>
+      </w:r>
+    </w:p>
+    <w:p>
+      <w:r>
+        <w:rPr>
+          <w:b/>
+          <w:color w:val="1F3864"/>
+          <w:sz w:val="23"/>
+        </w:rPr>
+        <w:t>4.1 MVI ‘Perfect Visit’ certification &amp; national co-marketing (strategic upside)</w:t>
+      </w:r>
+    </w:p>
+    <w:p>
+      <w:r>
+        <w:rPr>
+          <w:b w:val="0"/>
+          <w:i w:val="0"/>
+          <w:sz w:val="21"/>
+        </w:rPr>
+        <w:t>Azalea is pursuing certification by MultiView Incorporated (MVI) in The Perfect Visit and Perfect Phones - structured programs that certify an agency's patient-visit quality and its intake and telephone responsiveness against a defined standard. MVI, led by Andrew Reid, is launching a national, multi-platform advertising campaign that promotes hospice agencies certified in The Perfect Visit. As a certified agency, Azalea would be featured to a national audience - the kind of brand exposure normally reserved for the largest national operators with multi-million-dollar ad budgets, here made accessible to a local independent through the certification.</w:t>
+      </w:r>
+    </w:p>
+    <w:p>
+      <w:r>
+        <w:rPr>
+          <w:b w:val="0"/>
+          <w:i w:val="0"/>
+          <w:sz w:val="21"/>
+        </w:rPr>
+        <w:t>Azalea will develop an in-tandem local marketing plan timed to the national campaign - capturing the awareness it generates and converting it into local inquiries and referrals across the Tyler service area. The pairing of a national demand-generation engine with a focused local conversion plan is a differentiator no local competitor currently has, and it creates a credible path to take market share from the regional and national incumbents listed above.</w:t>
+      </w:r>
+    </w:p>
+    <w:p>
+      <w:r>
+        <w:rPr>
+          <w:b w:val="0"/>
+          <w:i/>
+          <w:sz w:val="19"/>
+        </w:rPr>
+        <w:t>Underwriting note: this is incremental upside. The financial projections in Section 11 remain conservative and assume no lift from the MVI certification or the national campaign; debt service is covered on the base-case census path without it. The certification represents potential growth above plan, not a dependency.</w:t>
+      </w:r>
+    </w:p>
+    <w:p>
+      <w:r>
         <w:br w:type="page"/>
       </w:r>
     </w:p>
@@ -2392,6 +2442,16 @@
           <w:i w:val="0"/>
           <w:sz w:val="21"/>
         </w:rPr>
+        <w:t xml:space="preserve">  - MVI 'Perfect Visit' / 'Perfect Phones' certification + Andrew Reid's national multi-platform campaign - national lead exposure for a local independent (upside, not in the base case)</w:t>
+      </w:r>
+    </w:p>
+    <w:p>
+      <w:r>
+        <w:rPr>
+          <w:b w:val="0"/>
+          <w:i w:val="0"/>
+          <w:sz w:val="21"/>
+        </w:rPr>
         <w:t xml:space="preserve">  - CMS hospice rates have risen every year since 2010; model carries a conservative 2.5%/yr escalation</w:t>
       </w:r>
     </w:p>
@@ -2578,6 +2638,16 @@
           <w:sz w:val="21"/>
         </w:rPr>
         <w:t>Digital: local SEO, Google Business Profile and review generation, Facebook/Instagram education and testimonial content to adults 45-75 within 50 miles, and Google Ads on high-intent hospice terms. Traditional &amp; community: quarterly educational mailers to SNFs/ALFs/physician offices, senior-focused print, branded admission books and referral pads, bereavement support groups, senior health fairs, and church health-ministry workshops. The model funds $3,000/mo ($36,000/yr) of marketing within fixed G&amp;A, sustained across all three years.</w:t>
+      </w:r>
+    </w:p>
+    <w:p>
+      <w:r>
+        <w:rPr>
+          <w:b w:val="0"/>
+          <w:i w:val="0"/>
+          <w:sz w:val="21"/>
+        </w:rPr>
+        <w:t>National co-marketing (upside): as an agency pursuing MVI 'Perfect Visit' and 'Perfect Phones' certification, Azalea will run an in-tandem local campaign timed to MVI's national, multi-platform advertising of certified hospice agencies (led by Andrew Reid) - local landing pages, geo-targeted digital, and referral-source outreach engineered to convert national awareness into Tyler-area leads. This sits on top of the budgeted spend above and is treated as upside; the base-case projections do not rely on it.</w:t>
       </w:r>
     </w:p>
     <w:p>

</xml_diff>